<commit_message>
Brand 5 offer-letter cover letters (logo header, fixed footer)
Add centered logo to header; remove duplicated body letterhead; correct
footer (STE 650 -> Suite 500, charles@ -> charlesp@, add UEI/CAGE).

Co-Authored-By: Claude Opus 4.8 <noreply@anthropic.com>
Claude-Session: https://claude.ai/code/session_01NijSmQZhjYZ7pQ9sAL7u2S
</commit_message>
<xml_diff>
--- a/offer_letter_1083_Birch_St_SW.docx
+++ b/offer_letter_1083_Birch_St_SW.docx
@@ -2,45 +2,6 @@
 <file path=word/document.xml><?xml version="1.0" encoding="utf-8"?>
 <w:document xmlns:wpc="http://schemas.microsoft.com/office/word/2010/wordprocessingCanvas" xmlns:cx="http://schemas.microsoft.com/office/drawing/2014/chartex" xmlns:cx1="http://schemas.microsoft.com/office/drawing/2015/9/8/chartex" xmlns:cx2="http://schemas.microsoft.com/office/drawing/2015/10/21/chartex" xmlns:cx3="http://schemas.microsoft.com/office/drawing/2016/5/9/chartex" xmlns:cx4="http://schemas.microsoft.com/office/drawing/2016/5/10/chartex" xmlns:cx5="http://schemas.microsoft.com/office/drawing/2016/5/11/chartex" xmlns:cx6="http://schemas.microsoft.com/office/drawing/2016/5/12/chartex" xmlns:cx7="http://schemas.microsoft.com/office/drawing/2016/5/13/chartex" xmlns:cx8="http://schemas.microsoft.com/office/drawing/2016/5/14/chartex" xmlns:mc="http://schemas.openxmlformats.org/markup-compatibility/2006" xmlns:aink="http://schemas.microsoft.com/office/drawing/2016/ink" xmlns:am3d="http://schemas.microsoft.com/office/drawing/2017/model3d" xmlns:o="urn:schemas-microsoft-com:office:office" xmlns:oel="http://schemas.microsoft.com/office/2019/extlst" xmlns:r="http://schemas.openxmlformats.org/officeDocument/2006/relationships" xmlns:m="http://schemas.openxmlformats.org/officeDocument/2006/math" xmlns:v="urn:schemas-microsoft-com:vml" xmlns:wp14="http://schemas.microsoft.com/office/word/2010/wordprocessingDrawing" xmlns:wp="http://schemas.openxmlformats.org/drawingml/2006/wordprocessingDrawing" xmlns:w10="urn:schemas-microsoft-com:office:word" xmlns:w="http://schemas.openxmlformats.org/wordprocessingml/2006/main" xmlns:w14="http://schemas.microsoft.com/office/word/2010/wordml" xmlns:w15="http://schemas.microsoft.com/office/word/2012/wordml" xmlns:w16cex="http://schemas.microsoft.com/office/word/2018/wordml/cex" xmlns:w16cid="http://schemas.microsoft.com/office/word/2016/wordml/cid" xmlns:w16="http://schemas.microsoft.com/office/word/2018/wordml" xmlns:w16du="http://schemas.microsoft.com/office/word/2023/wordml/word16du" xmlns:w16sdtdh="http://schemas.microsoft.com/office/word/2020/wordml/sdtdatahash" xmlns:w16sdtfl="http://schemas.microsoft.com/office/word/2024/wordml/sdtformatlock" xmlns:w16se="http://schemas.microsoft.com/office/word/2015/wordml/symex" xmlns:wpg="http://schemas.microsoft.com/office/word/2010/wordprocessingGroup" xmlns:wpi="http://schemas.microsoft.com/office/word/2010/wordprocessingInk" xmlns:wne="http://schemas.microsoft.com/office/word/2006/wordml" xmlns:wps="http://schemas.microsoft.com/office/word/2010/wordprocessingShape" mc:Ignorable="w14 w15 w16se w16cid w16 w16cex w16sdtdh w16sdtfl w16du wp14">
   <w:body>
-    <w:p>
-      <w:pPr>
-        <w:spacing w:after="40" w:before="0"/>
-        <w:jc w:val="center"/>
-      </w:pPr>
-      <w:r>
-        <w:rPr>
-          <w:b/>
-          <w:sz w:val="28"/>
-        </w:rPr>
-        <w:t>PARAGON GOVERNMENT SOLUTIONS LLC</w:t>
-      </w:r>
-    </w:p>
-    <w:p>
-      <w:pPr>
-        <w:spacing w:after="40" w:before="0"/>
-        <w:jc w:val="center"/>
-      </w:pPr>
-      <w:r>
-        <w:rPr>
-          <w:b w:val="0"/>
-          <w:sz w:val="20"/>
-        </w:rPr>
-        <w:t>11166 Fairfax Blvd, Suite 500  |  Fairfax, VA 22030</w:t>
-      </w:r>
-    </w:p>
-    <w:p>
-      <w:pPr>
-        <w:spacing w:after="320" w:before="0"/>
-        <w:jc w:val="center"/>
-      </w:pPr>
-      <w:r>
-        <w:rPr>
-          <w:b w:val="0"/>
-          <w:sz w:val="20"/>
-        </w:rPr>
-        <w:t>Phone: (888) 495-6935  |  Email: charles@paragongovsolutions.net</w:t>
-      </w:r>
-    </w:p>
     <w:p>
       <w:pPr>
         <w:spacing w:after="240"/>
@@ -704,56 +665,31 @@
       <w:pStyle w:val="Footer"/>
       <w:jc w:val="center"/>
     </w:pPr>
+    <w:r/>
     <w:r>
       <w:rPr>
         <w:b/>
-        <w:bCs/>
+        <w:color w:val="2E4057"/>
+        <w:sz w:val="16"/>
       </w:rPr>
       <w:t>Paragon Government Solutions LLC</w:t>
-    </w:r>
-    <w:r>
       <w:br/>
     </w:r>
     <w:r>
-      <w:t>11166</w:t>
+      <w:rPr>
+        <w:color w:val="555555"/>
+        <w:sz w:val="15"/>
+      </w:rPr>
+      <w:t>11166 Fairfax Blvd, Suite 500, Fairfax, VA 22030  |  (888) 495-6935  |  charlesp@paragongovsolutions.net</w:t>
+      <w:br/>
     </w:r>
     <w:r>
-      <w:t>, STE 650</w:t>
+      <w:rPr>
+        <w:color w:val="555555"/>
+        <w:sz w:val="15"/>
+      </w:rPr>
+      <w:t>UEI: FSCZBK8CBV82  |  CAGE: 9WX69  |  paragongovsolutions.net</w:t>
     </w:r>
-    <w:r>
-      <w:t xml:space="preserve"> | </w:t>
-    </w:r>
-    <w:r>
-      <w:t>Fairfax,</w:t>
-    </w:r>
-    <w:r>
-      <w:t xml:space="preserve"> VA 22</w:t>
-    </w:r>
-    <w:r>
-      <w:t>030</w:t>
-    </w:r>
-    <w:r>
-      <w:br/>
-      <w:t xml:space="preserve">Phone: </w:t>
-    </w:r>
-    <w:r>
-      <w:t>(888) 495.6935</w:t>
-    </w:r>
-    <w:r>
-      <w:t xml:space="preserve"> | Email: charles@paragongovsolutions.net</w:t>
-    </w:r>
-    <w:r>
-      <w:br/>
-      <w:t xml:space="preserve">UEI: FSCZBK8CBV82 | CAGE Code: 9WX69 | </w:t>
-    </w:r>
-    <w:hyperlink r:id="rId1" w:tgtFrame="_new" w:history="1">
-      <w:r>
-        <w:rPr>
-          <w:rStyle w:val="Hyperlink"/>
-        </w:rPr>
-        <w:t>www.paragongovsolutions.net</w:t>
-      </w:r>
-    </w:hyperlink>
   </w:p>
 </w:ftr>
 </file>
@@ -788,34 +724,26 @@
   <w:p>
     <w:pPr>
       <w:pStyle w:val="Header"/>
+      <w:jc w:val="center"/>
     </w:pPr>
+    <w:r/>
     <w:r>
-      <w:rPr>
-        <w:noProof/>
-      </w:rPr>
       <w:drawing>
-        <wp:inline distT="0" distB="0" distL="0" distR="0" wp14:anchorId="709CF590" wp14:editId="4D6ECCCE">
-          <wp:extent cx="1023257" cy="1023257"/>
-          <wp:effectExtent l="0" t="0" r="0" b="0"/>
-          <wp:docPr id="1675417903" name="Picture 1" descr="Logo, company name&#10;&#10;AI-generated content may be incorrect."/>
+        <wp:inline xmlns:a="http://schemas.openxmlformats.org/drawingml/2006/main" xmlns:pic="http://schemas.openxmlformats.org/drawingml/2006/picture">
+          <wp:extent cx="777240" cy="777240"/>
+          <wp:docPr id="1" name="Picture 1"/>
           <wp:cNvGraphicFramePr>
-            <a:graphicFrameLocks xmlns:a="http://schemas.openxmlformats.org/drawingml/2006/main" noChangeAspect="1"/>
+            <a:graphicFrameLocks noChangeAspect="1"/>
           </wp:cNvGraphicFramePr>
-          <a:graphic xmlns:a="http://schemas.openxmlformats.org/drawingml/2006/main">
+          <a:graphic>
             <a:graphicData uri="http://schemas.openxmlformats.org/drawingml/2006/picture">
-              <pic:pic xmlns:pic="http://schemas.openxmlformats.org/drawingml/2006/picture">
+              <pic:pic>
                 <pic:nvPicPr>
-                  <pic:cNvPr id="1675417903" name="Picture 1" descr="Logo, company name&#10;&#10;AI-generated content may be incorrect."/>
+                  <pic:cNvPr id="0" name="paragon_logo.png"/>
                   <pic:cNvPicPr/>
                 </pic:nvPicPr>
                 <pic:blipFill>
-                  <a:blip r:embed="rId1">
-                    <a:extLst>
-                      <a:ext uri="{28A0092B-C50C-407E-A947-70E740481C1C}">
-                        <a14:useLocalDpi xmlns:a14="http://schemas.microsoft.com/office/drawing/2010/main" val="0"/>
-                      </a:ext>
-                    </a:extLst>
-                  </a:blip>
+                  <a:blip r:embed="rId2"/>
                   <a:stretch>
                     <a:fillRect/>
                   </a:stretch>
@@ -823,11 +751,9 @@
                 <pic:spPr>
                   <a:xfrm>
                     <a:off x="0" y="0"/>
-                    <a:ext cx="1028715" cy="1028715"/>
+                    <a:ext cx="777240" cy="777240"/>
                   </a:xfrm>
-                  <a:prstGeom prst="rect">
-                    <a:avLst/>
-                  </a:prstGeom>
+                  <a:prstGeom prst="rect"/>
                 </pic:spPr>
               </pic:pic>
             </a:graphicData>

</xml_diff>